<commit_message>
Drawing pack completey updated. Literature review update in progress.
</commit_message>
<xml_diff>
--- a/Building the joint/Joint Assembly/Drawings/DRAWING PACK.docx
+++ b/Building the joint/Joint Assembly/Drawings/DRAWING PACK.docx
@@ -1,6 +1,6 @@
 
 <file path=word/document.xml><?xml version="1.0" encoding="utf-8"?>
-<w:document xmlns:wpc="http://schemas.microsoft.com/office/word/2010/wordprocessingCanvas" xmlns:cx="http://schemas.microsoft.com/office/drawing/2014/chartex" xmlns:cx1="http://schemas.microsoft.com/office/drawing/2015/9/8/chartex" xmlns:cx2="http://schemas.microsoft.com/office/drawing/2015/10/21/chartex" xmlns:cx3="http://schemas.microsoft.com/office/drawing/2016/5/9/chartex" xmlns:cx4="http://schemas.microsoft.com/office/drawing/2016/5/10/chartex" xmlns:cx5="http://schemas.microsoft.com/office/drawing/2016/5/11/chartex" xmlns:cx6="http://schemas.microsoft.com/office/drawing/2016/5/12/chartex" xmlns:cx7="http://schemas.microsoft.com/office/drawing/2016/5/13/chartex" xmlns:cx8="http://schemas.microsoft.com/office/drawing/2016/5/14/chartex" xmlns:mc="http://schemas.openxmlformats.org/markup-compatibility/2006" xmlns:aink="http://schemas.microsoft.com/office/drawing/2016/ink" xmlns:am3d="http://schemas.microsoft.com/office/drawing/2017/model3d" xmlns:o="urn:schemas-microsoft-com:office:office" xmlns:oel="http://schemas.microsoft.com/office/2019/extlst" xmlns:r="http://schemas.openxmlformats.org/officeDocument/2006/relationships" xmlns:m="http://schemas.openxmlformats.org/officeDocument/2006/math" xmlns:v="urn:schemas-microsoft-com:vml" xmlns:wp14="http://schemas.microsoft.com/office/word/2010/wordprocessingDrawing" xmlns:wp="http://schemas.openxmlformats.org/drawingml/2006/wordprocessingDrawing" xmlns:w10="urn:schemas-microsoft-com:office:word" xmlns:w="http://schemas.openxmlformats.org/wordprocessingml/2006/main" xmlns:w14="http://schemas.microsoft.com/office/word/2010/wordml" xmlns:w15="http://schemas.microsoft.com/office/word/2012/wordml" xmlns:w16cei="http://schemas.microsoft.com/office/word/2026/wordml/cei" xmlns:w16cex="http://schemas.microsoft.com/office/word/2018/wordml/cex" xmlns:w16cid="http://schemas.microsoft.com/office/word/2016/wordml/cid" xmlns:w16="http://schemas.microsoft.com/office/word/2018/wordml" xmlns:w16du="http://schemas.microsoft.com/office/word/2023/wordml/word16du" xmlns:w16sdtdh="http://schemas.microsoft.com/office/word/2020/wordml/sdtdatahash" xmlns:w16sdtfl="http://schemas.microsoft.com/office/word/2024/wordml/sdtformatlock" xmlns:w16se="http://schemas.microsoft.com/office/word/2015/wordml/symex" xmlns:wpg="http://schemas.microsoft.com/office/word/2010/wordprocessingGroup" xmlns:wpi="http://schemas.microsoft.com/office/word/2010/wordprocessingInk" xmlns:wne="http://schemas.microsoft.com/office/word/2006/wordml" xmlns:wps="http://schemas.microsoft.com/office/word/2010/wordprocessingShape" mc:Ignorable="w14 w15 w16se w16cid w16 w16cex w16sdtdh w16sdtfl w16du wp14">
+<w:document xmlns:wpc="http://schemas.microsoft.com/office/word/2010/wordprocessingCanvas" xmlns:cx="http://schemas.microsoft.com/office/drawing/2014/chartex" xmlns:cx1="http://schemas.microsoft.com/office/drawing/2015/9/8/chartex" xmlns:cx2="http://schemas.microsoft.com/office/drawing/2015/10/21/chartex" xmlns:cx3="http://schemas.microsoft.com/office/drawing/2016/5/9/chartex" xmlns:cx4="http://schemas.microsoft.com/office/drawing/2016/5/10/chartex" xmlns:cx5="http://schemas.microsoft.com/office/drawing/2016/5/11/chartex" xmlns:cx6="http://schemas.microsoft.com/office/drawing/2016/5/12/chartex" xmlns:cx7="http://schemas.microsoft.com/office/drawing/2016/5/13/chartex" xmlns:cx8="http://schemas.microsoft.com/office/drawing/2016/5/14/chartex" xmlns:mc="http://schemas.openxmlformats.org/markup-compatibility/2006" xmlns:aink="http://schemas.microsoft.com/office/drawing/2016/ink" xmlns:am3d="http://schemas.microsoft.com/office/drawing/2017/model3d" xmlns:o="urn:schemas-microsoft-com:office:office" xmlns:oel="http://schemas.microsoft.com/office/2019/extlst" xmlns:r="http://schemas.openxmlformats.org/officeDocument/2006/relationships" xmlns:m="http://schemas.openxmlformats.org/officeDocument/2006/math" xmlns:v="urn:schemas-microsoft-com:vml" xmlns:wp14="http://schemas.microsoft.com/office/word/2010/wordprocessingDrawing" xmlns:wp="http://schemas.openxmlformats.org/drawingml/2006/wordprocessingDrawing" xmlns:w10="urn:schemas-microsoft-com:office:word" xmlns:w="http://schemas.openxmlformats.org/wordprocessingml/2006/main" xmlns:w14="http://schemas.microsoft.com/office/word/2010/wordml" xmlns:w15="http://schemas.microsoft.com/office/word/2012/wordml" xmlns:w16cex="http://schemas.microsoft.com/office/word/2018/wordml/cex" xmlns:w16cid="http://schemas.microsoft.com/office/word/2016/wordml/cid" xmlns:w16="http://schemas.microsoft.com/office/word/2018/wordml" xmlns:w16du="http://schemas.microsoft.com/office/word/2023/wordml/word16du" xmlns:w16sdtdh="http://schemas.microsoft.com/office/word/2020/wordml/sdtdatahash" xmlns:w16sdtfl="http://schemas.microsoft.com/office/word/2024/wordml/sdtformatlock" xmlns:w16se="http://schemas.microsoft.com/office/word/2015/wordml/symex" xmlns:wpg="http://schemas.microsoft.com/office/word/2010/wordprocessingGroup" xmlns:wpi="http://schemas.microsoft.com/office/word/2010/wordprocessingInk" xmlns:wne="http://schemas.microsoft.com/office/word/2006/wordml" xmlns:wps="http://schemas.microsoft.com/office/word/2010/wordprocessingShape" mc:Ignorable="w14 w15 w16se w16cid w16 w16cex w16sdtdh w16sdtfl w16du wp14">
   <w:body>
     <w:p>
       <w:pPr>
@@ -60,7 +60,7 @@
       </w:tblGrid>
       <w:tr>
         <w:trPr>
-          <w:trHeight w:val="585"/>
+          <w:trHeight w:val="492"/>
         </w:trPr>
         <w:tc>
           <w:tcPr>
@@ -79,84 +79,76 @@
               <w:rPr>
                 <w:lang w:val="en-US"/>
               </w:rPr>
-              <w:t>24989142-01-00-00-00 ELECTROMAGNETIC BRAKE</w:t>
-            </w:r>
-          </w:p>
-        </w:tc>
-        <w:tc>
-          <w:tcPr>
-            <w:tcW w:w="2226" w:type="dxa"/>
-            <w:vMerge w:val="restart"/>
-            <w:vAlign w:val="center"/>
-          </w:tcPr>
-          <w:p>
-            <w:pPr>
-              <w:jc w:val="center"/>
-              <w:rPr>
-                <w:lang w:val="en-US"/>
-              </w:rPr>
-            </w:pPr>
-            <w:r>
-              <w:rPr>
-                <w:lang w:val="en-US"/>
-              </w:rPr>
-              <w:t>24989142-01-01-00-00 ELECTROMAGNET</w:t>
-            </w:r>
-          </w:p>
-        </w:tc>
-        <w:tc>
-          <w:tcPr>
-            <w:tcW w:w="2226" w:type="dxa"/>
-            <w:vMerge w:val="restart"/>
-            <w:vAlign w:val="center"/>
-          </w:tcPr>
-          <w:p>
-            <w:pPr>
-              <w:jc w:val="center"/>
-              <w:rPr>
-                <w:lang w:val="en-US"/>
-              </w:rPr>
-            </w:pPr>
-            <w:proofErr w:type="gramStart"/>
-            <w:r>
-              <w:rPr>
-                <w:lang w:val="en-US"/>
-              </w:rPr>
-              <w:t>24989142-</w:t>
-            </w:r>
-            <w:proofErr w:type="gramEnd"/>
-            <w:r>
-              <w:rPr>
-                <w:lang w:val="en-US"/>
-              </w:rPr>
-              <w:t>01-01-01-00 ELECTROMAGNET COVER</w:t>
-            </w:r>
-          </w:p>
-        </w:tc>
-        <w:tc>
-          <w:tcPr>
-            <w:tcW w:w="2226" w:type="dxa"/>
-            <w:vAlign w:val="center"/>
-          </w:tcPr>
-          <w:p>
-            <w:pPr>
-              <w:jc w:val="center"/>
-              <w:rPr>
-                <w:lang w:val="en-US"/>
-              </w:rPr>
-            </w:pPr>
-            <w:r>
-              <w:rPr>
-                <w:lang w:val="en-US"/>
-              </w:rPr>
-              <w:t>24989142-01-01-01-01 ELECTROMAGNET COVER BODY</w:t>
-            </w:r>
+              <w:t>24989142-01-00-00 ELECTROMAGNETIC BRAKE</w:t>
+            </w:r>
+          </w:p>
+        </w:tc>
+        <w:tc>
+          <w:tcPr>
+            <w:tcW w:w="2226" w:type="dxa"/>
+            <w:vAlign w:val="center"/>
+          </w:tcPr>
+          <w:p>
+            <w:pPr>
+              <w:jc w:val="center"/>
+              <w:rPr>
+                <w:lang w:val="en-US"/>
+              </w:rPr>
+            </w:pPr>
+            <w:r>
+              <w:rPr>
+                <w:lang w:val="en-US"/>
+              </w:rPr>
+              <w:t>24989142-01-00-00</w:t>
+            </w:r>
+          </w:p>
+          <w:p>
+            <w:pPr>
+              <w:jc w:val="center"/>
+              <w:rPr>
+                <w:lang w:val="en-US"/>
+              </w:rPr>
+            </w:pPr>
+            <w:r>
+              <w:rPr>
+                <w:lang w:val="en-US"/>
+              </w:rPr>
+              <w:t>JOINT SHAFT</w:t>
+            </w:r>
+          </w:p>
+        </w:tc>
+        <w:tc>
+          <w:tcPr>
+            <w:tcW w:w="2226" w:type="dxa"/>
+            <w:vAlign w:val="center"/>
+          </w:tcPr>
+          <w:p>
+            <w:pPr>
+              <w:jc w:val="center"/>
+              <w:rPr>
+                <w:lang w:val="en-US"/>
+              </w:rPr>
+            </w:pPr>
+          </w:p>
+        </w:tc>
+        <w:tc>
+          <w:tcPr>
+            <w:tcW w:w="2226" w:type="dxa"/>
+            <w:vAlign w:val="center"/>
+          </w:tcPr>
+          <w:p>
+            <w:pPr>
+              <w:jc w:val="center"/>
+              <w:rPr>
+                <w:lang w:val="en-US"/>
+              </w:rPr>
+            </w:pPr>
           </w:p>
         </w:tc>
       </w:tr>
       <w:tr>
         <w:trPr>
-          <w:trHeight w:val="585"/>
+          <w:trHeight w:val="483"/>
         </w:trPr>
         <w:tc>
           <w:tcPr>
@@ -176,65 +168,69 @@
         <w:tc>
           <w:tcPr>
             <w:tcW w:w="2226" w:type="dxa"/>
-            <w:vMerge/>
-            <w:vAlign w:val="center"/>
-          </w:tcPr>
-          <w:p>
-            <w:pPr>
-              <w:jc w:val="center"/>
-              <w:rPr>
-                <w:lang w:val="en-US"/>
-              </w:rPr>
-            </w:pPr>
-          </w:p>
-        </w:tc>
-        <w:tc>
-          <w:tcPr>
-            <w:tcW w:w="2226" w:type="dxa"/>
-            <w:vMerge/>
-            <w:vAlign w:val="center"/>
-          </w:tcPr>
-          <w:p>
-            <w:pPr>
-              <w:jc w:val="center"/>
-              <w:rPr>
-                <w:lang w:val="en-US"/>
-              </w:rPr>
-            </w:pPr>
-          </w:p>
-        </w:tc>
-        <w:tc>
-          <w:tcPr>
-            <w:tcW w:w="2226" w:type="dxa"/>
-            <w:vAlign w:val="center"/>
-          </w:tcPr>
-          <w:p>
-            <w:pPr>
-              <w:jc w:val="center"/>
-              <w:rPr>
-                <w:lang w:val="en-US"/>
-              </w:rPr>
-            </w:pPr>
-            <w:proofErr w:type="gramStart"/>
-            <w:r>
-              <w:rPr>
-                <w:lang w:val="en-US"/>
-              </w:rPr>
-              <w:t>24989142-</w:t>
-            </w:r>
-            <w:proofErr w:type="gramEnd"/>
-            <w:r>
-              <w:rPr>
-                <w:lang w:val="en-US"/>
-              </w:rPr>
-              <w:t>01-01-01-02 ELECTROMAGNET COVER BOTTOM</w:t>
-            </w:r>
+            <w:vAlign w:val="center"/>
+          </w:tcPr>
+          <w:p>
+            <w:pPr>
+              <w:jc w:val="center"/>
+              <w:rPr>
+                <w:lang w:val="en-US"/>
+              </w:rPr>
+            </w:pPr>
+            <w:r>
+              <w:rPr>
+                <w:lang w:val="en-US"/>
+              </w:rPr>
+              <w:t>24989142-02-00-00</w:t>
+            </w:r>
+          </w:p>
+          <w:p>
+            <w:pPr>
+              <w:jc w:val="center"/>
+              <w:rPr>
+                <w:lang w:val="en-US"/>
+              </w:rPr>
+            </w:pPr>
+            <w:r>
+              <w:rPr>
+                <w:lang w:val="en-US"/>
+              </w:rPr>
+              <w:t>BEARING HOUSING TOP</w:t>
+            </w:r>
+          </w:p>
+        </w:tc>
+        <w:tc>
+          <w:tcPr>
+            <w:tcW w:w="2226" w:type="dxa"/>
+            <w:vAlign w:val="center"/>
+          </w:tcPr>
+          <w:p>
+            <w:pPr>
+              <w:jc w:val="center"/>
+              <w:rPr>
+                <w:lang w:val="en-US"/>
+              </w:rPr>
+            </w:pPr>
+          </w:p>
+        </w:tc>
+        <w:tc>
+          <w:tcPr>
+            <w:tcW w:w="2226" w:type="dxa"/>
+            <w:vAlign w:val="center"/>
+          </w:tcPr>
+          <w:p>
+            <w:pPr>
+              <w:jc w:val="center"/>
+              <w:rPr>
+                <w:lang w:val="en-US"/>
+              </w:rPr>
+            </w:pPr>
           </w:p>
         </w:tc>
       </w:tr>
       <w:tr>
         <w:trPr>
-          <w:trHeight w:val="220"/>
+          <w:trHeight w:val="483"/>
         </w:trPr>
         <w:tc>
           <w:tcPr>
@@ -254,36 +250,49 @@
         <w:tc>
           <w:tcPr>
             <w:tcW w:w="2226" w:type="dxa"/>
-            <w:vMerge/>
-            <w:vAlign w:val="center"/>
-          </w:tcPr>
-          <w:p>
-            <w:pPr>
-              <w:jc w:val="center"/>
-              <w:rPr>
-                <w:lang w:val="en-US"/>
-              </w:rPr>
-            </w:pPr>
-          </w:p>
-        </w:tc>
-        <w:tc>
-          <w:tcPr>
-            <w:tcW w:w="2226" w:type="dxa"/>
-            <w:vAlign w:val="center"/>
-          </w:tcPr>
-          <w:p>
-            <w:pPr>
-              <w:jc w:val="center"/>
-              <w:rPr>
-                <w:lang w:val="en-US"/>
-              </w:rPr>
-            </w:pPr>
-            <w:r>
-              <w:rPr>
-                <w:lang w:val="en-US"/>
-              </w:rPr>
-              <w:t>24989142-01-01-02-00 PRESSURE TAB PLATFORM</w:t>
-            </w:r>
+            <w:vAlign w:val="center"/>
+          </w:tcPr>
+          <w:p>
+            <w:pPr>
+              <w:jc w:val="center"/>
+              <w:rPr>
+                <w:lang w:val="en-US"/>
+              </w:rPr>
+            </w:pPr>
+            <w:r>
+              <w:rPr>
+                <w:lang w:val="en-US"/>
+              </w:rPr>
+              <w:t>24989142-03-00-00</w:t>
+            </w:r>
+          </w:p>
+          <w:p>
+            <w:pPr>
+              <w:jc w:val="center"/>
+              <w:rPr>
+                <w:lang w:val="en-US"/>
+              </w:rPr>
+            </w:pPr>
+            <w:r>
+              <w:rPr>
+                <w:lang w:val="en-US"/>
+              </w:rPr>
+              <w:t>BEARING HOUSE BOTTOM</w:t>
+            </w:r>
+          </w:p>
+        </w:tc>
+        <w:tc>
+          <w:tcPr>
+            <w:tcW w:w="2226" w:type="dxa"/>
+            <w:vAlign w:val="center"/>
+          </w:tcPr>
+          <w:p>
+            <w:pPr>
+              <w:jc w:val="center"/>
+              <w:rPr>
+                <w:lang w:val="en-US"/>
+              </w:rPr>
+            </w:pPr>
           </w:p>
         </w:tc>
         <w:tc>
@@ -303,7 +312,7 @@
       </w:tr>
       <w:tr>
         <w:trPr>
-          <w:trHeight w:val="220"/>
+          <w:trHeight w:val="579"/>
         </w:trPr>
         <w:tc>
           <w:tcPr>
@@ -323,35 +332,69 @@
         <w:tc>
           <w:tcPr>
             <w:tcW w:w="2226" w:type="dxa"/>
-            <w:vMerge/>
-            <w:vAlign w:val="center"/>
-          </w:tcPr>
-          <w:p>
-            <w:pPr>
-              <w:jc w:val="center"/>
-              <w:rPr>
-                <w:lang w:val="en-US"/>
-              </w:rPr>
-            </w:pPr>
-          </w:p>
-        </w:tc>
-        <w:tc>
-          <w:tcPr>
-            <w:tcW w:w="2226" w:type="dxa"/>
-            <w:vAlign w:val="center"/>
-          </w:tcPr>
-          <w:p>
-            <w:pPr>
-              <w:jc w:val="center"/>
-              <w:rPr>
-                <w:lang w:val="en-US"/>
-              </w:rPr>
-            </w:pPr>
-            <w:r>
-              <w:rPr>
-                <w:lang w:val="en-US"/>
-              </w:rPr>
-              <w:t>24989142-01-01-03-00 SOLENOID CORE</w:t>
+            <w:vMerge w:val="restart"/>
+            <w:vAlign w:val="center"/>
+          </w:tcPr>
+          <w:p>
+            <w:pPr>
+              <w:jc w:val="center"/>
+              <w:rPr>
+                <w:lang w:val="en-US"/>
+              </w:rPr>
+            </w:pPr>
+            <w:r>
+              <w:rPr>
+                <w:lang w:val="en-US"/>
+              </w:rPr>
+              <w:t>24989142-04-00-00</w:t>
+            </w:r>
+          </w:p>
+          <w:p>
+            <w:pPr>
+              <w:jc w:val="center"/>
+              <w:rPr>
+                <w:lang w:val="en-US"/>
+              </w:rPr>
+            </w:pPr>
+            <w:r>
+              <w:rPr>
+                <w:lang w:val="en-US"/>
+              </w:rPr>
+              <w:t>JOINT HOUSING BOTTOM</w:t>
+            </w:r>
+          </w:p>
+        </w:tc>
+        <w:tc>
+          <w:tcPr>
+            <w:tcW w:w="2226" w:type="dxa"/>
+            <w:vAlign w:val="center"/>
+          </w:tcPr>
+          <w:p>
+            <w:pPr>
+              <w:jc w:val="center"/>
+              <w:rPr>
+                <w:lang w:val="en-US"/>
+              </w:rPr>
+            </w:pPr>
+            <w:r>
+              <w:rPr>
+                <w:lang w:val="en-US"/>
+              </w:rPr>
+              <w:t>24989142-04-01-00</w:t>
+            </w:r>
+          </w:p>
+          <w:p>
+            <w:pPr>
+              <w:jc w:val="center"/>
+              <w:rPr>
+                <w:lang w:val="en-US"/>
+              </w:rPr>
+            </w:pPr>
+            <w:r>
+              <w:rPr>
+                <w:lang w:val="en-US"/>
+              </w:rPr>
+              <w:t>JOINT HOUSING BOTTOM LEFT</w:t>
             </w:r>
           </w:p>
         </w:tc>
@@ -372,7 +415,7 @@
       </w:tr>
       <w:tr>
         <w:trPr>
-          <w:trHeight w:val="220"/>
+          <w:trHeight w:val="579"/>
         </w:trPr>
         <w:tc>
           <w:tcPr>
@@ -420,7 +463,21 @@
               <w:rPr>
                 <w:lang w:val="en-US"/>
               </w:rPr>
-              <w:t>24989142-01-01-04-00 SOLENOID YOKE</w:t>
+              <w:t>24989142-04-02-00</w:t>
+            </w:r>
+          </w:p>
+          <w:p>
+            <w:pPr>
+              <w:jc w:val="center"/>
+              <w:rPr>
+                <w:lang w:val="en-US"/>
+              </w:rPr>
+            </w:pPr>
+            <w:r>
+              <w:rPr>
+                <w:lang w:val="en-US"/>
+              </w:rPr>
+              <w:t>JOINT HOUSING BOTTOM BACK</w:t>
             </w:r>
           </w:p>
         </w:tc>
@@ -441,7 +498,7 @@
       </w:tr>
       <w:tr>
         <w:trPr>
-          <w:trHeight w:val="167"/>
+          <w:trHeight w:val="579"/>
         </w:trPr>
         <w:tc>
           <w:tcPr>
@@ -461,35 +518,50 @@
         <w:tc>
           <w:tcPr>
             <w:tcW w:w="2226" w:type="dxa"/>
-            <w:vAlign w:val="center"/>
-          </w:tcPr>
-          <w:p>
-            <w:pPr>
-              <w:jc w:val="center"/>
-              <w:rPr>
-                <w:lang w:val="en-US"/>
-              </w:rPr>
-            </w:pPr>
-            <w:r>
-              <w:rPr>
-                <w:lang w:val="en-US"/>
-              </w:rPr>
-              <w:t>24989142-01-02-00 PRESSURE TAB</w:t>
-            </w:r>
-          </w:p>
-        </w:tc>
-        <w:tc>
-          <w:tcPr>
-            <w:tcW w:w="2226" w:type="dxa"/>
-            <w:vAlign w:val="center"/>
-          </w:tcPr>
-          <w:p>
-            <w:pPr>
-              <w:jc w:val="center"/>
-              <w:rPr>
-                <w:lang w:val="en-US"/>
-              </w:rPr>
-            </w:pPr>
+            <w:vMerge/>
+            <w:vAlign w:val="center"/>
+          </w:tcPr>
+          <w:p>
+            <w:pPr>
+              <w:jc w:val="center"/>
+              <w:rPr>
+                <w:lang w:val="en-US"/>
+              </w:rPr>
+            </w:pPr>
+          </w:p>
+        </w:tc>
+        <w:tc>
+          <w:tcPr>
+            <w:tcW w:w="2226" w:type="dxa"/>
+            <w:vAlign w:val="center"/>
+          </w:tcPr>
+          <w:p>
+            <w:pPr>
+              <w:jc w:val="center"/>
+              <w:rPr>
+                <w:lang w:val="en-US"/>
+              </w:rPr>
+            </w:pPr>
+            <w:r>
+              <w:rPr>
+                <w:lang w:val="en-US"/>
+              </w:rPr>
+              <w:t>24989142-04-03-00</w:t>
+            </w:r>
+          </w:p>
+          <w:p>
+            <w:pPr>
+              <w:jc w:val="center"/>
+              <w:rPr>
+                <w:lang w:val="en-US"/>
+              </w:rPr>
+            </w:pPr>
+            <w:r>
+              <w:rPr>
+                <w:lang w:val="en-US"/>
+              </w:rPr>
+              <w:t>JOINT HOUSING BOTTOM RIGHT</w:t>
+            </w:r>
           </w:p>
         </w:tc>
         <w:tc>
@@ -509,7 +581,7 @@
       </w:tr>
       <w:tr>
         <w:trPr>
-          <w:trHeight w:val="167"/>
+          <w:trHeight w:val="483"/>
         </w:trPr>
         <w:tc>
           <w:tcPr>
@@ -542,22 +614,56 @@
               <w:rPr>
                 <w:lang w:val="en-US"/>
               </w:rPr>
-              <w:t>HEX BOLT M6X1</w:t>
-            </w:r>
-          </w:p>
-        </w:tc>
-        <w:tc>
-          <w:tcPr>
-            <w:tcW w:w="2226" w:type="dxa"/>
-            <w:vAlign w:val="center"/>
-          </w:tcPr>
-          <w:p>
-            <w:pPr>
-              <w:jc w:val="center"/>
-              <w:rPr>
-                <w:lang w:val="en-US"/>
-              </w:rPr>
-            </w:pPr>
+              <w:t>24989142-05-00-00</w:t>
+            </w:r>
+          </w:p>
+          <w:p>
+            <w:pPr>
+              <w:jc w:val="center"/>
+              <w:rPr>
+                <w:lang w:val="en-US"/>
+              </w:rPr>
+            </w:pPr>
+            <w:r>
+              <w:rPr>
+                <w:lang w:val="en-US"/>
+              </w:rPr>
+              <w:t>JOINT HOUSING TOP-FRONT</w:t>
+            </w:r>
+          </w:p>
+        </w:tc>
+        <w:tc>
+          <w:tcPr>
+            <w:tcW w:w="2226" w:type="dxa"/>
+            <w:vAlign w:val="center"/>
+          </w:tcPr>
+          <w:p>
+            <w:pPr>
+              <w:jc w:val="center"/>
+              <w:rPr>
+                <w:lang w:val="en-US"/>
+              </w:rPr>
+            </w:pPr>
+            <w:r>
+              <w:rPr>
+                <w:lang w:val="en-US"/>
+              </w:rPr>
+              <w:t>24989142-05-01-00</w:t>
+            </w:r>
+          </w:p>
+          <w:p>
+            <w:pPr>
+              <w:jc w:val="center"/>
+              <w:rPr>
+                <w:lang w:val="en-US"/>
+              </w:rPr>
+            </w:pPr>
+            <w:r>
+              <w:rPr>
+                <w:lang w:val="en-US"/>
+              </w:rPr>
+              <w:t>JOINT HOUSING TOP BACK</w:t>
+            </w:r>
           </w:p>
         </w:tc>
         <w:tc>
@@ -577,7 +683,7 @@
       </w:tr>
       <w:tr>
         <w:trPr>
-          <w:trHeight w:val="167"/>
+          <w:trHeight w:val="483"/>
         </w:trPr>
         <w:tc>
           <w:tcPr>
@@ -610,7 +716,21 @@
               <w:rPr>
                 <w:lang w:val="en-US"/>
               </w:rPr>
-              <w:t>WASHER</w:t>
+              <w:t>24989142-06-00-00</w:t>
+            </w:r>
+          </w:p>
+          <w:p>
+            <w:pPr>
+              <w:jc w:val="center"/>
+              <w:rPr>
+                <w:lang w:val="en-US"/>
+              </w:rPr>
+            </w:pPr>
+            <w:r>
+              <w:rPr>
+                <w:lang w:val="en-US"/>
+              </w:rPr>
+              <w:t>JOINT HOUSING TOP-BACK</w:t>
             </w:r>
           </w:p>
         </w:tc>
@@ -645,7 +765,7 @@
       </w:tr>
       <w:tr>
         <w:trPr>
-          <w:trHeight w:val="167"/>
+          <w:trHeight w:val="653"/>
         </w:trPr>
         <w:tc>
           <w:tcPr>
@@ -665,35 +785,70 @@
         <w:tc>
           <w:tcPr>
             <w:tcW w:w="2226" w:type="dxa"/>
-            <w:vAlign w:val="center"/>
-          </w:tcPr>
-          <w:p>
-            <w:pPr>
-              <w:jc w:val="center"/>
-              <w:rPr>
-                <w:lang w:val="en-US"/>
-              </w:rPr>
-            </w:pPr>
-            <w:r>
-              <w:rPr>
-                <w:lang w:val="en-US"/>
-              </w:rPr>
-              <w:t>24989142-01-03-00-00 FRICTION PLATE</w:t>
-            </w:r>
-          </w:p>
-        </w:tc>
-        <w:tc>
-          <w:tcPr>
-            <w:tcW w:w="2226" w:type="dxa"/>
-            <w:vAlign w:val="center"/>
-          </w:tcPr>
-          <w:p>
-            <w:pPr>
-              <w:jc w:val="center"/>
-              <w:rPr>
-                <w:lang w:val="en-US"/>
-              </w:rPr>
-            </w:pPr>
+            <w:vMerge w:val="restart"/>
+            <w:vAlign w:val="center"/>
+          </w:tcPr>
+          <w:p>
+            <w:pPr>
+              <w:jc w:val="center"/>
+              <w:rPr>
+                <w:lang w:val="en-US"/>
+              </w:rPr>
+            </w:pPr>
+            <w:r>
+              <w:rPr>
+                <w:lang w:val="en-US"/>
+              </w:rPr>
+              <w:t>24989142-07-00-00</w:t>
+            </w:r>
+          </w:p>
+          <w:p>
+            <w:pPr>
+              <w:jc w:val="center"/>
+              <w:rPr>
+                <w:lang w:val="en-US"/>
+              </w:rPr>
+            </w:pPr>
+            <w:r>
+              <w:rPr>
+                <w:lang w:val="en-US"/>
+              </w:rPr>
+              <w:t>BASE LINK</w:t>
+            </w:r>
+          </w:p>
+        </w:tc>
+        <w:tc>
+          <w:tcPr>
+            <w:tcW w:w="2226" w:type="dxa"/>
+            <w:vAlign w:val="center"/>
+          </w:tcPr>
+          <w:p>
+            <w:pPr>
+              <w:jc w:val="center"/>
+              <w:rPr>
+                <w:lang w:val="en-US"/>
+              </w:rPr>
+            </w:pPr>
+            <w:r>
+              <w:rPr>
+                <w:lang w:val="en-US"/>
+              </w:rPr>
+              <w:t>24989142-07-01-00</w:t>
+            </w:r>
+          </w:p>
+          <w:p>
+            <w:pPr>
+              <w:jc w:val="center"/>
+              <w:rPr>
+                <w:lang w:val="en-US"/>
+              </w:rPr>
+            </w:pPr>
+            <w:r>
+              <w:rPr>
+                <w:lang w:val="en-US"/>
+              </w:rPr>
+              <w:t>BASE LINK PLATE</w:t>
+            </w:r>
           </w:p>
         </w:tc>
         <w:tc>
@@ -713,7 +868,7 @@
       </w:tr>
       <w:tr>
         <w:trPr>
-          <w:trHeight w:val="167"/>
+          <w:trHeight w:val="653"/>
         </w:trPr>
         <w:tc>
           <w:tcPr>
@@ -733,35 +888,56 @@
         <w:tc>
           <w:tcPr>
             <w:tcW w:w="2226" w:type="dxa"/>
-            <w:vAlign w:val="center"/>
-          </w:tcPr>
-          <w:p>
-            <w:pPr>
-              <w:jc w:val="center"/>
-              <w:rPr>
-                <w:lang w:val="en-US"/>
-              </w:rPr>
-            </w:pPr>
-            <w:r>
-              <w:rPr>
-                <w:lang w:val="en-US"/>
-              </w:rPr>
-              <w:t>HEXAGON FLAT BOLT</w:t>
-            </w:r>
-          </w:p>
-        </w:tc>
-        <w:tc>
-          <w:tcPr>
-            <w:tcW w:w="2226" w:type="dxa"/>
-            <w:vAlign w:val="center"/>
-          </w:tcPr>
-          <w:p>
-            <w:pPr>
-              <w:jc w:val="center"/>
-              <w:rPr>
-                <w:lang w:val="en-US"/>
-              </w:rPr>
-            </w:pPr>
+            <w:vMerge/>
+            <w:vAlign w:val="center"/>
+          </w:tcPr>
+          <w:p>
+            <w:pPr>
+              <w:jc w:val="center"/>
+              <w:rPr>
+                <w:lang w:val="en-US"/>
+              </w:rPr>
+            </w:pPr>
+          </w:p>
+        </w:tc>
+        <w:tc>
+          <w:tcPr>
+            <w:tcW w:w="2226" w:type="dxa"/>
+            <w:vAlign w:val="center"/>
+          </w:tcPr>
+          <w:p>
+            <w:pPr>
+              <w:jc w:val="center"/>
+              <w:rPr>
+                <w:lang w:val="en-US"/>
+              </w:rPr>
+            </w:pPr>
+            <w:r>
+              <w:rPr>
+                <w:lang w:val="en-US"/>
+              </w:rPr>
+              <w:t>24989142-07-02-00</w:t>
+            </w:r>
+          </w:p>
+          <w:p>
+            <w:pPr>
+              <w:jc w:val="center"/>
+              <w:rPr>
+                <w:lang w:val="en-US"/>
+              </w:rPr>
+            </w:pPr>
+            <w:r>
+              <w:rPr>
+                <w:lang w:val="en-US"/>
+              </w:rPr>
+              <w:t xml:space="preserve">BASE LINK </w:t>
+            </w:r>
+            <w:r>
+              <w:rPr>
+                <w:lang w:val="en-US"/>
+              </w:rPr>
+              <w:t>PIPE</w:t>
+            </w:r>
           </w:p>
         </w:tc>
         <w:tc>
@@ -781,7 +957,7 @@
       </w:tr>
       <w:tr>
         <w:trPr>
-          <w:trHeight w:val="167"/>
+          <w:trHeight w:val="579"/>
         </w:trPr>
         <w:tc>
           <w:tcPr>
@@ -801,20 +977,984 @@
         <w:tc>
           <w:tcPr>
             <w:tcW w:w="2226" w:type="dxa"/>
-            <w:vAlign w:val="center"/>
-          </w:tcPr>
-          <w:p>
-            <w:pPr>
-              <w:jc w:val="center"/>
-              <w:rPr>
-                <w:lang w:val="en-US"/>
-              </w:rPr>
-            </w:pPr>
-            <w:r>
-              <w:rPr>
-                <w:lang w:val="en-US"/>
-              </w:rPr>
-              <w:t>COUNTERSUNK FLAT SCREW</w:t>
+            <w:vMerge w:val="restart"/>
+            <w:vAlign w:val="center"/>
+          </w:tcPr>
+          <w:p>
+            <w:pPr>
+              <w:jc w:val="center"/>
+              <w:rPr>
+                <w:lang w:val="en-US"/>
+              </w:rPr>
+            </w:pPr>
+            <w:r>
+              <w:rPr>
+                <w:lang w:val="en-US"/>
+              </w:rPr>
+              <w:t>24989142-08-00-00</w:t>
+            </w:r>
+          </w:p>
+          <w:p>
+            <w:pPr>
+              <w:jc w:val="center"/>
+              <w:rPr>
+                <w:lang w:val="en-US"/>
+              </w:rPr>
+            </w:pPr>
+            <w:r>
+              <w:rPr>
+                <w:lang w:val="en-US"/>
+              </w:rPr>
+              <w:t>ARTICULATING LINK</w:t>
+            </w:r>
+          </w:p>
+        </w:tc>
+        <w:tc>
+          <w:tcPr>
+            <w:tcW w:w="2226" w:type="dxa"/>
+            <w:vAlign w:val="center"/>
+          </w:tcPr>
+          <w:p>
+            <w:pPr>
+              <w:jc w:val="center"/>
+              <w:rPr>
+                <w:lang w:val="en-US"/>
+              </w:rPr>
+            </w:pPr>
+            <w:r>
+              <w:rPr>
+                <w:lang w:val="en-US"/>
+              </w:rPr>
+              <w:t>24989142-08-01-00</w:t>
+            </w:r>
+          </w:p>
+          <w:p>
+            <w:pPr>
+              <w:jc w:val="center"/>
+              <w:rPr>
+                <w:lang w:val="en-US"/>
+              </w:rPr>
+            </w:pPr>
+            <w:r>
+              <w:rPr>
+                <w:lang w:val="en-US"/>
+              </w:rPr>
+              <w:t>ARTICULATING LINK PIPE</w:t>
+            </w:r>
+          </w:p>
+        </w:tc>
+        <w:tc>
+          <w:tcPr>
+            <w:tcW w:w="2226" w:type="dxa"/>
+            <w:vAlign w:val="center"/>
+          </w:tcPr>
+          <w:p>
+            <w:pPr>
+              <w:jc w:val="center"/>
+              <w:rPr>
+                <w:lang w:val="en-US"/>
+              </w:rPr>
+            </w:pPr>
+          </w:p>
+        </w:tc>
+      </w:tr>
+      <w:tr>
+        <w:trPr>
+          <w:trHeight w:val="579"/>
+        </w:trPr>
+        <w:tc>
+          <w:tcPr>
+            <w:tcW w:w="2338" w:type="dxa"/>
+            <w:vMerge/>
+            <w:vAlign w:val="center"/>
+          </w:tcPr>
+          <w:p>
+            <w:pPr>
+              <w:jc w:val="center"/>
+              <w:rPr>
+                <w:lang w:val="en-US"/>
+              </w:rPr>
+            </w:pPr>
+          </w:p>
+        </w:tc>
+        <w:tc>
+          <w:tcPr>
+            <w:tcW w:w="2226" w:type="dxa"/>
+            <w:vMerge/>
+            <w:vAlign w:val="center"/>
+          </w:tcPr>
+          <w:p>
+            <w:pPr>
+              <w:jc w:val="center"/>
+              <w:rPr>
+                <w:lang w:val="en-US"/>
+              </w:rPr>
+            </w:pPr>
+          </w:p>
+        </w:tc>
+        <w:tc>
+          <w:tcPr>
+            <w:tcW w:w="2226" w:type="dxa"/>
+            <w:vAlign w:val="center"/>
+          </w:tcPr>
+          <w:p>
+            <w:pPr>
+              <w:jc w:val="center"/>
+              <w:rPr>
+                <w:lang w:val="en-US"/>
+              </w:rPr>
+            </w:pPr>
+            <w:r>
+              <w:rPr>
+                <w:lang w:val="en-US"/>
+              </w:rPr>
+              <w:t>24989142-08-02-00</w:t>
+            </w:r>
+          </w:p>
+        </w:tc>
+        <w:tc>
+          <w:tcPr>
+            <w:tcW w:w="2226" w:type="dxa"/>
+            <w:vAlign w:val="center"/>
+          </w:tcPr>
+          <w:p>
+            <w:pPr>
+              <w:jc w:val="center"/>
+              <w:rPr>
+                <w:lang w:val="en-US"/>
+              </w:rPr>
+            </w:pPr>
+          </w:p>
+        </w:tc>
+      </w:tr>
+      <w:tr>
+        <w:trPr>
+          <w:trHeight w:val="579"/>
+        </w:trPr>
+        <w:tc>
+          <w:tcPr>
+            <w:tcW w:w="2338" w:type="dxa"/>
+            <w:vMerge/>
+            <w:vAlign w:val="center"/>
+          </w:tcPr>
+          <w:p>
+            <w:pPr>
+              <w:jc w:val="center"/>
+              <w:rPr>
+                <w:lang w:val="en-US"/>
+              </w:rPr>
+            </w:pPr>
+          </w:p>
+        </w:tc>
+        <w:tc>
+          <w:tcPr>
+            <w:tcW w:w="2226" w:type="dxa"/>
+            <w:vMerge/>
+            <w:vAlign w:val="center"/>
+          </w:tcPr>
+          <w:p>
+            <w:pPr>
+              <w:jc w:val="center"/>
+              <w:rPr>
+                <w:lang w:val="en-US"/>
+              </w:rPr>
+            </w:pPr>
+          </w:p>
+        </w:tc>
+        <w:tc>
+          <w:tcPr>
+            <w:tcW w:w="2226" w:type="dxa"/>
+            <w:vAlign w:val="center"/>
+          </w:tcPr>
+          <w:p>
+            <w:pPr>
+              <w:jc w:val="center"/>
+              <w:rPr>
+                <w:lang w:val="en-US"/>
+              </w:rPr>
+            </w:pPr>
+            <w:r>
+              <w:rPr>
+                <w:lang w:val="en-US"/>
+              </w:rPr>
+              <w:t>ARTICULATING LINK PROBE HUB</w:t>
+            </w:r>
+          </w:p>
+        </w:tc>
+        <w:tc>
+          <w:tcPr>
+            <w:tcW w:w="2226" w:type="dxa"/>
+            <w:vAlign w:val="center"/>
+          </w:tcPr>
+          <w:p>
+            <w:pPr>
+              <w:jc w:val="center"/>
+              <w:rPr>
+                <w:lang w:val="en-US"/>
+              </w:rPr>
+            </w:pPr>
+          </w:p>
+        </w:tc>
+      </w:tr>
+      <w:tr>
+        <w:trPr>
+          <w:trHeight w:val="483"/>
+        </w:trPr>
+        <w:tc>
+          <w:tcPr>
+            <w:tcW w:w="2338" w:type="dxa"/>
+            <w:vMerge/>
+            <w:vAlign w:val="center"/>
+          </w:tcPr>
+          <w:p>
+            <w:pPr>
+              <w:jc w:val="center"/>
+              <w:rPr>
+                <w:lang w:val="en-US"/>
+              </w:rPr>
+            </w:pPr>
+          </w:p>
+        </w:tc>
+        <w:tc>
+          <w:tcPr>
+            <w:tcW w:w="2226" w:type="dxa"/>
+            <w:vAlign w:val="center"/>
+          </w:tcPr>
+          <w:p>
+            <w:pPr>
+              <w:jc w:val="center"/>
+              <w:rPr>
+                <w:lang w:val="en-US"/>
+              </w:rPr>
+            </w:pPr>
+          </w:p>
+        </w:tc>
+        <w:tc>
+          <w:tcPr>
+            <w:tcW w:w="2226" w:type="dxa"/>
+            <w:vAlign w:val="center"/>
+          </w:tcPr>
+          <w:p>
+            <w:pPr>
+              <w:jc w:val="center"/>
+              <w:rPr>
+                <w:lang w:val="en-US"/>
+              </w:rPr>
+            </w:pPr>
+            <w:r>
+              <w:rPr>
+                <w:lang w:val="en-US"/>
+              </w:rPr>
+              <w:t>24989142-08-03-00</w:t>
+            </w:r>
+          </w:p>
+          <w:p>
+            <w:pPr>
+              <w:jc w:val="center"/>
+              <w:rPr>
+                <w:lang w:val="en-US"/>
+              </w:rPr>
+            </w:pPr>
+            <w:r>
+              <w:rPr>
+                <w:lang w:val="en-US"/>
+              </w:rPr>
+              <w:t>ARTICULATING LINK PROBE</w:t>
+            </w:r>
+          </w:p>
+        </w:tc>
+        <w:tc>
+          <w:tcPr>
+            <w:tcW w:w="2226" w:type="dxa"/>
+            <w:vAlign w:val="center"/>
+          </w:tcPr>
+          <w:p>
+            <w:pPr>
+              <w:jc w:val="center"/>
+              <w:rPr>
+                <w:lang w:val="en-US"/>
+              </w:rPr>
+            </w:pPr>
+          </w:p>
+        </w:tc>
+      </w:tr>
+      <w:tr>
+        <w:trPr>
+          <w:trHeight w:val="483"/>
+        </w:trPr>
+        <w:tc>
+          <w:tcPr>
+            <w:tcW w:w="2338" w:type="dxa"/>
+            <w:vMerge/>
+            <w:vAlign w:val="center"/>
+          </w:tcPr>
+          <w:p>
+            <w:pPr>
+              <w:jc w:val="center"/>
+              <w:rPr>
+                <w:lang w:val="en-US"/>
+              </w:rPr>
+            </w:pPr>
+          </w:p>
+        </w:tc>
+        <w:tc>
+          <w:tcPr>
+            <w:tcW w:w="2226" w:type="dxa"/>
+            <w:vAlign w:val="center"/>
+          </w:tcPr>
+          <w:p>
+            <w:pPr>
+              <w:jc w:val="center"/>
+              <w:rPr>
+                <w:lang w:val="en-US"/>
+              </w:rPr>
+            </w:pPr>
+            <w:r>
+              <w:rPr>
+                <w:lang w:val="en-US"/>
+              </w:rPr>
+              <w:t>24989142-09-00-00</w:t>
+            </w:r>
+          </w:p>
+          <w:p>
+            <w:pPr>
+              <w:jc w:val="center"/>
+              <w:rPr>
+                <w:lang w:val="en-US"/>
+              </w:rPr>
+            </w:pPr>
+            <w:r>
+              <w:rPr>
+                <w:lang w:val="en-US"/>
+              </w:rPr>
+              <w:t>BRAKE DISC KEY</w:t>
+            </w:r>
+          </w:p>
+        </w:tc>
+        <w:tc>
+          <w:tcPr>
+            <w:tcW w:w="2226" w:type="dxa"/>
+            <w:vAlign w:val="center"/>
+          </w:tcPr>
+          <w:p>
+            <w:pPr>
+              <w:jc w:val="center"/>
+              <w:rPr>
+                <w:lang w:val="en-US"/>
+              </w:rPr>
+            </w:pPr>
+          </w:p>
+        </w:tc>
+        <w:tc>
+          <w:tcPr>
+            <w:tcW w:w="2226" w:type="dxa"/>
+            <w:vAlign w:val="center"/>
+          </w:tcPr>
+          <w:p>
+            <w:pPr>
+              <w:jc w:val="center"/>
+              <w:rPr>
+                <w:lang w:val="en-US"/>
+              </w:rPr>
+            </w:pPr>
+          </w:p>
+        </w:tc>
+      </w:tr>
+      <w:tr>
+        <w:trPr>
+          <w:trHeight w:val="328"/>
+        </w:trPr>
+        <w:tc>
+          <w:tcPr>
+            <w:tcW w:w="2338" w:type="dxa"/>
+            <w:vMerge/>
+            <w:vAlign w:val="center"/>
+          </w:tcPr>
+          <w:p>
+            <w:pPr>
+              <w:jc w:val="center"/>
+              <w:rPr>
+                <w:lang w:val="en-US"/>
+              </w:rPr>
+            </w:pPr>
+          </w:p>
+        </w:tc>
+        <w:tc>
+          <w:tcPr>
+            <w:tcW w:w="2226" w:type="dxa"/>
+            <w:vMerge w:val="restart"/>
+            <w:vAlign w:val="center"/>
+          </w:tcPr>
+          <w:p>
+            <w:pPr>
+              <w:jc w:val="center"/>
+              <w:rPr>
+                <w:lang w:val="en-US"/>
+              </w:rPr>
+            </w:pPr>
+            <w:r>
+              <w:rPr>
+                <w:lang w:val="en-US"/>
+              </w:rPr>
+              <w:t>24989142-10-00-00</w:t>
+            </w:r>
+          </w:p>
+          <w:p>
+            <w:pPr>
+              <w:jc w:val="center"/>
+              <w:rPr>
+                <w:lang w:val="en-US"/>
+              </w:rPr>
+            </w:pPr>
+            <w:r>
+              <w:rPr>
+                <w:lang w:val="en-US"/>
+              </w:rPr>
+              <w:t>ELECTROMAGNET</w:t>
+            </w:r>
+          </w:p>
+        </w:tc>
+        <w:tc>
+          <w:tcPr>
+            <w:tcW w:w="2226" w:type="dxa"/>
+            <w:vAlign w:val="center"/>
+          </w:tcPr>
+          <w:p>
+            <w:pPr>
+              <w:jc w:val="center"/>
+              <w:rPr>
+                <w:lang w:val="en-US"/>
+              </w:rPr>
+            </w:pPr>
+            <w:r>
+              <w:rPr>
+                <w:lang w:val="en-US"/>
+              </w:rPr>
+              <w:t>24989142-10-01-00</w:t>
+            </w:r>
+          </w:p>
+          <w:p>
+            <w:pPr>
+              <w:jc w:val="center"/>
+              <w:rPr>
+                <w:lang w:val="en-US"/>
+              </w:rPr>
+            </w:pPr>
+            <w:r>
+              <w:rPr>
+                <w:lang w:val="en-US"/>
+              </w:rPr>
+              <w:t>SOLENOID YOKE</w:t>
+            </w:r>
+          </w:p>
+        </w:tc>
+        <w:tc>
+          <w:tcPr>
+            <w:tcW w:w="2226" w:type="dxa"/>
+            <w:vAlign w:val="center"/>
+          </w:tcPr>
+          <w:p>
+            <w:pPr>
+              <w:jc w:val="center"/>
+              <w:rPr>
+                <w:lang w:val="en-US"/>
+              </w:rPr>
+            </w:pPr>
+          </w:p>
+        </w:tc>
+      </w:tr>
+      <w:tr>
+        <w:trPr>
+          <w:trHeight w:val="326"/>
+        </w:trPr>
+        <w:tc>
+          <w:tcPr>
+            <w:tcW w:w="2338" w:type="dxa"/>
+            <w:vMerge/>
+            <w:vAlign w:val="center"/>
+          </w:tcPr>
+          <w:p>
+            <w:pPr>
+              <w:jc w:val="center"/>
+              <w:rPr>
+                <w:lang w:val="en-US"/>
+              </w:rPr>
+            </w:pPr>
+          </w:p>
+        </w:tc>
+        <w:tc>
+          <w:tcPr>
+            <w:tcW w:w="2226" w:type="dxa"/>
+            <w:vMerge/>
+            <w:vAlign w:val="center"/>
+          </w:tcPr>
+          <w:p>
+            <w:pPr>
+              <w:jc w:val="center"/>
+              <w:rPr>
+                <w:lang w:val="en-US"/>
+              </w:rPr>
+            </w:pPr>
+          </w:p>
+        </w:tc>
+        <w:tc>
+          <w:tcPr>
+            <w:tcW w:w="2226" w:type="dxa"/>
+            <w:vAlign w:val="center"/>
+          </w:tcPr>
+          <w:p>
+            <w:pPr>
+              <w:jc w:val="center"/>
+              <w:rPr>
+                <w:lang w:val="en-US"/>
+              </w:rPr>
+            </w:pPr>
+            <w:r>
+              <w:rPr>
+                <w:lang w:val="en-US"/>
+              </w:rPr>
+              <w:t>24989142-10-02-00</w:t>
+            </w:r>
+          </w:p>
+          <w:p>
+            <w:pPr>
+              <w:jc w:val="center"/>
+              <w:rPr>
+                <w:lang w:val="en-US"/>
+              </w:rPr>
+            </w:pPr>
+            <w:r>
+              <w:rPr>
+                <w:lang w:val="en-US"/>
+              </w:rPr>
+              <w:t>SOLENOID CORE</w:t>
+            </w:r>
+          </w:p>
+        </w:tc>
+        <w:tc>
+          <w:tcPr>
+            <w:tcW w:w="2226" w:type="dxa"/>
+            <w:vAlign w:val="center"/>
+          </w:tcPr>
+          <w:p>
+            <w:pPr>
+              <w:jc w:val="center"/>
+              <w:rPr>
+                <w:lang w:val="en-US"/>
+              </w:rPr>
+            </w:pPr>
+          </w:p>
+        </w:tc>
+      </w:tr>
+      <w:tr>
+        <w:trPr>
+          <w:trHeight w:val="326"/>
+        </w:trPr>
+        <w:tc>
+          <w:tcPr>
+            <w:tcW w:w="2338" w:type="dxa"/>
+            <w:vMerge/>
+            <w:vAlign w:val="center"/>
+          </w:tcPr>
+          <w:p>
+            <w:pPr>
+              <w:jc w:val="center"/>
+              <w:rPr>
+                <w:lang w:val="en-US"/>
+              </w:rPr>
+            </w:pPr>
+          </w:p>
+        </w:tc>
+        <w:tc>
+          <w:tcPr>
+            <w:tcW w:w="2226" w:type="dxa"/>
+            <w:vMerge/>
+            <w:vAlign w:val="center"/>
+          </w:tcPr>
+          <w:p>
+            <w:pPr>
+              <w:jc w:val="center"/>
+              <w:rPr>
+                <w:lang w:val="en-US"/>
+              </w:rPr>
+            </w:pPr>
+          </w:p>
+        </w:tc>
+        <w:tc>
+          <w:tcPr>
+            <w:tcW w:w="2226" w:type="dxa"/>
+            <w:vAlign w:val="center"/>
+          </w:tcPr>
+          <w:p>
+            <w:pPr>
+              <w:jc w:val="center"/>
+              <w:rPr>
+                <w:lang w:val="en-US"/>
+              </w:rPr>
+            </w:pPr>
+            <w:r>
+              <w:rPr>
+                <w:lang w:val="en-US"/>
+              </w:rPr>
+              <w:t>24989142-10-03-00</w:t>
+            </w:r>
+          </w:p>
+          <w:p>
+            <w:pPr>
+              <w:jc w:val="center"/>
+              <w:rPr>
+                <w:lang w:val="en-US"/>
+              </w:rPr>
+            </w:pPr>
+            <w:r>
+              <w:rPr>
+                <w:lang w:val="en-US"/>
+              </w:rPr>
+              <w:t>PRESSURE TAB PLATFORM</w:t>
+            </w:r>
+          </w:p>
+        </w:tc>
+        <w:tc>
+          <w:tcPr>
+            <w:tcW w:w="2226" w:type="dxa"/>
+            <w:vAlign w:val="center"/>
+          </w:tcPr>
+          <w:p>
+            <w:pPr>
+              <w:jc w:val="center"/>
+              <w:rPr>
+                <w:lang w:val="en-US"/>
+              </w:rPr>
+            </w:pPr>
+          </w:p>
+        </w:tc>
+      </w:tr>
+      <w:tr>
+        <w:trPr>
+          <w:trHeight w:val="869"/>
+        </w:trPr>
+        <w:tc>
+          <w:tcPr>
+            <w:tcW w:w="2338" w:type="dxa"/>
+            <w:vMerge/>
+            <w:vAlign w:val="center"/>
+          </w:tcPr>
+          <w:p>
+            <w:pPr>
+              <w:jc w:val="center"/>
+              <w:rPr>
+                <w:lang w:val="en-US"/>
+              </w:rPr>
+            </w:pPr>
+          </w:p>
+        </w:tc>
+        <w:tc>
+          <w:tcPr>
+            <w:tcW w:w="2226" w:type="dxa"/>
+            <w:vMerge/>
+            <w:vAlign w:val="center"/>
+          </w:tcPr>
+          <w:p>
+            <w:pPr>
+              <w:jc w:val="center"/>
+              <w:rPr>
+                <w:lang w:val="en-US"/>
+              </w:rPr>
+            </w:pPr>
+          </w:p>
+        </w:tc>
+        <w:tc>
+          <w:tcPr>
+            <w:tcW w:w="2226" w:type="dxa"/>
+            <w:vMerge w:val="restart"/>
+            <w:vAlign w:val="center"/>
+          </w:tcPr>
+          <w:p>
+            <w:pPr>
+              <w:jc w:val="center"/>
+              <w:rPr>
+                <w:lang w:val="en-US"/>
+              </w:rPr>
+            </w:pPr>
+            <w:r>
+              <w:rPr>
+                <w:lang w:val="en-US"/>
+              </w:rPr>
+              <w:t>24989142-10-04-00</w:t>
+            </w:r>
+          </w:p>
+          <w:p>
+            <w:pPr>
+              <w:jc w:val="center"/>
+              <w:rPr>
+                <w:lang w:val="en-US"/>
+              </w:rPr>
+            </w:pPr>
+            <w:r>
+              <w:rPr>
+                <w:lang w:val="en-US"/>
+              </w:rPr>
+              <w:t>ELECTROMAGNET COVER</w:t>
+            </w:r>
+          </w:p>
+        </w:tc>
+        <w:tc>
+          <w:tcPr>
+            <w:tcW w:w="2226" w:type="dxa"/>
+            <w:vAlign w:val="center"/>
+          </w:tcPr>
+          <w:p>
+            <w:pPr>
+              <w:jc w:val="center"/>
+              <w:rPr>
+                <w:lang w:val="en-US"/>
+              </w:rPr>
+            </w:pPr>
+            <w:r>
+              <w:rPr>
+                <w:lang w:val="en-US"/>
+              </w:rPr>
+              <w:t>24989142-10-0</w:t>
+            </w:r>
+            <w:r>
+              <w:rPr>
+                <w:lang w:val="en-US"/>
+              </w:rPr>
+              <w:t>4-01</w:t>
+            </w:r>
+          </w:p>
+          <w:p>
+            <w:pPr>
+              <w:jc w:val="center"/>
+              <w:rPr>
+                <w:lang w:val="en-US"/>
+              </w:rPr>
+            </w:pPr>
+            <w:r>
+              <w:rPr>
+                <w:lang w:val="en-US"/>
+              </w:rPr>
+              <w:t>ELECTROMAGNET COVER BODY</w:t>
+            </w:r>
+          </w:p>
+        </w:tc>
+      </w:tr>
+      <w:tr>
+        <w:trPr>
+          <w:trHeight w:val="868"/>
+        </w:trPr>
+        <w:tc>
+          <w:tcPr>
+            <w:tcW w:w="2338" w:type="dxa"/>
+            <w:vMerge/>
+            <w:vAlign w:val="center"/>
+          </w:tcPr>
+          <w:p>
+            <w:pPr>
+              <w:jc w:val="center"/>
+              <w:rPr>
+                <w:lang w:val="en-US"/>
+              </w:rPr>
+            </w:pPr>
+          </w:p>
+        </w:tc>
+        <w:tc>
+          <w:tcPr>
+            <w:tcW w:w="2226" w:type="dxa"/>
+            <w:vMerge/>
+            <w:vAlign w:val="center"/>
+          </w:tcPr>
+          <w:p>
+            <w:pPr>
+              <w:jc w:val="center"/>
+              <w:rPr>
+                <w:lang w:val="en-US"/>
+              </w:rPr>
+            </w:pPr>
+          </w:p>
+        </w:tc>
+        <w:tc>
+          <w:tcPr>
+            <w:tcW w:w="2226" w:type="dxa"/>
+            <w:vMerge/>
+            <w:vAlign w:val="center"/>
+          </w:tcPr>
+          <w:p>
+            <w:pPr>
+              <w:jc w:val="center"/>
+              <w:rPr>
+                <w:lang w:val="en-US"/>
+              </w:rPr>
+            </w:pPr>
+          </w:p>
+        </w:tc>
+        <w:tc>
+          <w:tcPr>
+            <w:tcW w:w="2226" w:type="dxa"/>
+            <w:vAlign w:val="center"/>
+          </w:tcPr>
+          <w:p>
+            <w:pPr>
+              <w:jc w:val="center"/>
+              <w:rPr>
+                <w:lang w:val="en-US"/>
+              </w:rPr>
+            </w:pPr>
+            <w:r>
+              <w:rPr>
+                <w:lang w:val="en-US"/>
+              </w:rPr>
+              <w:t>24989142-10-04-02</w:t>
+            </w:r>
+          </w:p>
+          <w:p>
+            <w:pPr>
+              <w:jc w:val="center"/>
+              <w:rPr>
+                <w:lang w:val="en-US"/>
+              </w:rPr>
+            </w:pPr>
+            <w:r>
+              <w:rPr>
+                <w:lang w:val="en-US"/>
+              </w:rPr>
+              <w:t>ELECTROMAGNET COVER BOTTOM</w:t>
+            </w:r>
+          </w:p>
+        </w:tc>
+      </w:tr>
+      <w:tr>
+        <w:trPr>
+          <w:trHeight w:val="483"/>
+        </w:trPr>
+        <w:tc>
+          <w:tcPr>
+            <w:tcW w:w="2338" w:type="dxa"/>
+            <w:vMerge/>
+            <w:vAlign w:val="center"/>
+          </w:tcPr>
+          <w:p>
+            <w:pPr>
+              <w:jc w:val="center"/>
+              <w:rPr>
+                <w:lang w:val="en-US"/>
+              </w:rPr>
+            </w:pPr>
+          </w:p>
+        </w:tc>
+        <w:tc>
+          <w:tcPr>
+            <w:tcW w:w="2226" w:type="dxa"/>
+            <w:vAlign w:val="center"/>
+          </w:tcPr>
+          <w:p>
+            <w:pPr>
+              <w:jc w:val="center"/>
+              <w:rPr>
+                <w:lang w:val="en-US"/>
+              </w:rPr>
+            </w:pPr>
+            <w:r>
+              <w:rPr>
+                <w:lang w:val="en-US"/>
+              </w:rPr>
+              <w:t>24989142-11-00-00</w:t>
+            </w:r>
+          </w:p>
+          <w:p>
+            <w:pPr>
+              <w:jc w:val="center"/>
+              <w:rPr>
+                <w:lang w:val="en-US"/>
+              </w:rPr>
+            </w:pPr>
+            <w:r>
+              <w:rPr>
+                <w:lang w:val="en-US"/>
+              </w:rPr>
+              <w:t>PRESSURE TAB</w:t>
+            </w:r>
+          </w:p>
+        </w:tc>
+        <w:tc>
+          <w:tcPr>
+            <w:tcW w:w="2226" w:type="dxa"/>
+            <w:vAlign w:val="center"/>
+          </w:tcPr>
+          <w:p>
+            <w:pPr>
+              <w:jc w:val="center"/>
+              <w:rPr>
+                <w:lang w:val="en-US"/>
+              </w:rPr>
+            </w:pPr>
+          </w:p>
+        </w:tc>
+        <w:tc>
+          <w:tcPr>
+            <w:tcW w:w="2226" w:type="dxa"/>
+            <w:vAlign w:val="center"/>
+          </w:tcPr>
+          <w:p>
+            <w:pPr>
+              <w:jc w:val="center"/>
+              <w:rPr>
+                <w:lang w:val="en-US"/>
+              </w:rPr>
+            </w:pPr>
+          </w:p>
+        </w:tc>
+      </w:tr>
+      <w:tr>
+        <w:trPr>
+          <w:trHeight w:val="483"/>
+        </w:trPr>
+        <w:tc>
+          <w:tcPr>
+            <w:tcW w:w="2338" w:type="dxa"/>
+            <w:vMerge/>
+            <w:vAlign w:val="center"/>
+          </w:tcPr>
+          <w:p>
+            <w:pPr>
+              <w:jc w:val="center"/>
+              <w:rPr>
+                <w:lang w:val="en-US"/>
+              </w:rPr>
+            </w:pPr>
+          </w:p>
+        </w:tc>
+        <w:tc>
+          <w:tcPr>
+            <w:tcW w:w="2226" w:type="dxa"/>
+            <w:vAlign w:val="center"/>
+          </w:tcPr>
+          <w:p>
+            <w:pPr>
+              <w:jc w:val="center"/>
+              <w:rPr>
+                <w:lang w:val="en-US"/>
+              </w:rPr>
+            </w:pPr>
+            <w:r>
+              <w:rPr>
+                <w:lang w:val="en-US"/>
+              </w:rPr>
+              <w:t>24989142-12-00-00</w:t>
+            </w:r>
+          </w:p>
+          <w:p>
+            <w:pPr>
+              <w:jc w:val="center"/>
+              <w:rPr>
+                <w:lang w:val="en-US"/>
+              </w:rPr>
+            </w:pPr>
+            <w:r>
+              <w:rPr>
+                <w:lang w:val="en-US"/>
+              </w:rPr>
+              <w:t>BRAKE DISC</w:t>
             </w:r>
           </w:p>
         </w:tc>
@@ -900,8 +2040,16 @@
         <w:rPr>
           <w:lang w:val="en-US"/>
         </w:rPr>
-        <w:t>Supervisor: K. Schreve</w:t>
+        <w:t xml:space="preserve">Supervisor: K. </w:t>
       </w:r>
+      <w:proofErr w:type="spellStart"/>
+      <w:r>
+        <w:rPr>
+          <w:lang w:val="en-US"/>
+        </w:rPr>
+        <w:t>Schreve</w:t>
+      </w:r>
+      <w:proofErr w:type="spellEnd"/>
     </w:p>
     <w:sectPr>
       <w:pgSz w:w="11906" w:h="16838"/>

</xml_diff>